<commit_message>
Fix HTML structure and add lazy loading
</commit_message>
<xml_diff>
--- a/CSN 1101.docx
+++ b/CSN 1101.docx
@@ -20,37 +20,45 @@
     </w:p>
     <w:p/>
     <w:p>
+      <w:pPr>
+        <w:rPr>
+          <w:lang w:eastAsia="en-GB"/>
+        </w:rPr>
+      </w:pPr>
       <w:r>
-        <w:t>1. GitHub Repository:</w:t>
+        <w:rPr>
+          <w:lang w:eastAsia="en-GB"/>
+        </w:rPr>
+        <w:t>1. GitHub Repository Link: https://github.com/sannienkn-cmd/my-portfolio</w:t>
       </w:r>
     </w:p>
     <w:p>
+      <w:pPr>
+        <w:rPr>
+          <w:lang w:eastAsia="en-GB"/>
+        </w:rPr>
+      </w:pPr>
       <w:r>
-        <w:t>https://github.com/sannienkn-cmd/my-portfolio</w:t>
+        <w:rPr>
+          <w:lang w:eastAsia="en-GB"/>
+        </w:rPr>
+        <w:t>2. GitHub Pages Live URL: https://sannienkn-cmd.github.io/my-portfolio/</w:t>
+      </w:r>
+    </w:p>
+    <w:p>
+      <w:pPr>
+        <w:rPr>
+          <w:lang w:eastAsia="en-GB"/>
+        </w:rPr>
+      </w:pPr>
+      <w:r>
+        <w:rPr>
+          <w:lang w:eastAsia="en-GB"/>
+        </w:rPr>
+        <w:t>3. Vercel Live URL: https://my-portfolio-seven-nu-clq8q3b3sw.vercel.app</w:t>
       </w:r>
     </w:p>
     <w:p/>
-    <w:p>
-      <w:r>
-        <w:t>2. GitHub Pages (Live):</w:t>
-      </w:r>
-    </w:p>
-    <w:p>
-      <w:r>
-        <w:t>https://sannienkn-cmd.github.io/my-portfolio/</w:t>
-      </w:r>
-    </w:p>
-    <w:p/>
-    <w:p>
-      <w:r>
-        <w:t>3. Vercel (Live):</w:t>
-      </w:r>
-    </w:p>
-    <w:p>
-      <w:r>
-        <w:t>https://my-portfolio-seven-nu-clq8q3b3sw.vercel.app</w:t>
-      </w:r>
-    </w:p>
     <w:sectPr>
       <w:pgSz w:w="11906" w:h="16838"/>
       <w:pgMar w:top="1440" w:right="1440" w:bottom="1440" w:left="1440" w:header="708" w:footer="708" w:gutter="0"/>
@@ -990,6 +998,11 @@
       <w:spacing w:val="5"/>
     </w:rPr>
   </w:style>
+  <w:style w:type="character" w:customStyle="1" w:styleId="qwen-markdown-text">
+    <w:name w:val="qwen-markdown-text"/>
+    <w:basedOn w:val="DefaultParagraphFont"/>
+    <w:rsid w:val="00FF53BC"/>
+  </w:style>
 </w:styles>
 </file>
 

</xml_diff>